<commit_message>
Restore original ethics declaration in RRCP submission package
</commit_message>
<xml_diff>
--- a/revision/deliverables/Manuscript_MARKED_COMPARISON.docx
+++ b/revision/deliverables/Manuscript_MARKED_COMPARISON.docx
@@ -488,258 +488,246 @@
     <w:p>
       <w:r>
         <w:rPr>
-          <w:strike/>
-          <w:color w:val="9C2020"/>
-        </w:rPr>
+          <w:color w:val="15653A"/>
+        </w:rPr>
+        <w:t>Study design and reference reproduction</w:t>
+      </w:r>
+    </w:p>
+    <w:p>
+      <w:r>
+        <w:rPr>
+          <w:color w:val="15653A"/>
+        </w:rPr>
+        <w:t>This secondary ecological analysis used the Brazilian Mortality Information System (SIM) to examine national underlying-cause asthma mortality in Brazil during 2014–2021. The corrected primary population comprised people aged ≥7 completed years. We analysed ages 5–34 separately and used the nested 7–34 group to assess sensitivity to ages five and six; 35–59 and ≥60 provided further comparisons. The historical analysis using continuous age &gt;6 was reproduced separately. The primary analysis retained IBGE 2018 denominators and Brazil 2014 standard weights. Sensitivity analyses and descriptive decomposition complemented the primary estimates. We applied no multiple-testing correction.</w:t>
+      </w:r>
+    </w:p>
+    <w:p>
+      <w:r>
+        <w:rPr>
+          <w:color w:val="15653A"/>
+        </w:rPr>
+        <w:t>We reproduced the historical analysis against the archived manuscript and versioned analytical code. Provenance details are reported under Software, reproducibility and ethics.</w:t>
+      </w:r>
+    </w:p>
+    <w:p>
+      <w:r>
+        <w:rPr>
+          <w:color w:val="15653A"/>
+        </w:rPr>
+        <w:t>Selection, COVID mentions and record identity</w:t>
+      </w:r>
+    </w:p>
+    <w:p>
+      <w:r>
+        <w:rPr>
+          <w:color w:val="15653A"/>
+        </w:rPr>
+        <w:t>We selected records whose underlying cause field, CAUSABAS, contained International Classification of Diseases, tenth revision (ICD-10), J45 or J46 [5]. To retain the historical search scope, the corrected COVID rule searched LINHAA, LINHAB, LINHAC, LINHAD and LINHAII for B342, U072, U071 or literal COVID-19. A match in any field excluded the record once. We logged each code frequency and overlapping combination separately. Sensitivities used the original rule without U071 or retained all records with COVID mentions.</w:t>
+      </w:r>
+    </w:p>
+    <w:p>
+      <w:r>
+        <w:rPr>
+          <w:color w:val="15653A"/>
+        </w:rPr>
+        <w:t>The historical key combined death date, elapsed-days age, underlying cause and five cause lines. It collapsed two 2018 records with differences in occupation and administrative fields. The death-declaration identifier NUMERODO, described in the SIM dictionary [6], is absent from the public CSVs. Available fields therefore cannot establish a shared death. We retained both records and assessed their collapse as a sensitivity. Supplementary methods document the rows and fields.</w:t>
+      </w:r>
+    </w:p>
+    <w:p>
+      <w:r>
+        <w:rPr>
+          <w:color w:val="15653A"/>
+        </w:rPr>
+        <w:t>Calendar ages and analytical domains</w:t>
+      </w:r>
+    </w:p>
+    <w:p>
+      <w:r>
+        <w:rPr>
+          <w:color w:val="15653A"/>
+        </w:rPr>
+        <w:t>Completed age was the difference between death and birth years, reduced by one if death preceded that year's birthday. For births on 29 February, the anniversary in a non-leap year was 1 March. Missing or invalid dates and birth after death were excluded and logged separately. We applied no upper-age exclusion and grouped ages ≥90 into the IBGE 90+ interval. Date parsing is detailed in the supplement.</w:t>
+      </w:r>
+    </w:p>
+    <w:p>
+      <w:r>
+        <w:rPr>
+          <w:color w:val="15653A"/>
+        </w:rPr>
+        <w:t>Calendar age defined the ≥7, 5–34, 7–34, 35–59 and ≥60 groups. One sensitivity used days/365.25, with its floor defining single-year bins. The historical reproduction retained the continuous &gt;6 threshold as a separate population.</w:t>
+      </w:r>
+    </w:p>
+    <w:p>
+      <w:r>
+        <w:rPr>
+          <w:color w:val="15653A"/>
+        </w:rPr>
+        <w:t>Denominators and direct standardisation</w:t>
+      </w:r>
+    </w:p>
+    <w:p>
+      <w:r>
+        <w:rPr>
+          <w:color w:val="15653A"/>
+        </w:rPr>
+        <w:t>National single-year populations for both sexes came from the Brazilian Institute of Geography and Statistics (IBGE) 2018 revision [7]; the 2024 revision following the 2022 Census provided a sensitivity [8]. Both revisions provide single-year ages 0–89 and an open 90+ interval; workbook extraction is documented in the supplement. Corrected crude rates matched each numerator to the same population age range. To reproduce the historical construction, we divided continuous-age &gt;6 deaths by the entire population and separately by population ≥7. The latter comparator retains the small mismatch between its historical numerator and denominator.</w:t>
+      </w:r>
+    </w:p>
+    <w:p>
+      <w:r>
+        <w:rPr>
+          <w:color w:val="15653A"/>
+        </w:rPr>
+        <w:t>For age domain D and year t, we calculated the directly age-standardised rate (ASR) as follows.</w:t>
+      </w:r>
+    </w:p>
+    <w:p>
+      <w:r>
+        <w:rPr>
+          <w:color w:val="15653A"/>
+        </w:rPr>
+        <w:t>ASR(t,D) = Σ[a∈D] w(a,D) × 100,000 × deaths(a,t) / population(a,t).</w:t>
+      </w:r>
+    </w:p>
+    <w:p>
+      <w:r>
+        <w:rPr>
+          <w:color w:val="15653A"/>
+        </w:rPr>
+        <w:t>w(a,D) = population(a,2014) / Σ[j∈D] population(j,2014), so Σ[a∈D] w(a,D) = 1.</w:t>
+      </w:r>
+    </w:p>
+    <w:p>
+      <w:r>
+        <w:rPr>
+          <w:color w:val="15653A"/>
+        </w:rPr>
+        <w:t>Weights were fixed across years and normalised separately within each age domain, including 5–34 and 7–34. Each denominator revision supplied its own Brazil 2014 standard population. Deaths and population at ≥90 shared one open interval. World Health Organization (WHO) standardisation used five-year bands [9], combining the 90–94, 95–99 and ≥100 weights for 90+. We allocated three fifths of the WHO 5–9 weight to 7–9 before normalisation, assuming a uniform distribution within that band. Missing death-count cells were assigned zero; population cells had to be complete and positive. We checked that Brazil-2014-standardised and aligned crude rates were equal in 2014.</w:t>
+      </w:r>
+    </w:p>
+    <w:p>
+      <w:r>
+        <w:rPr>
+          <w:color w:val="15653A"/>
+        </w:rPr>
+        <w:t>Trends, count models and sensitivity scenarios</w:t>
+      </w:r>
+    </w:p>
+    <w:p>
+      <w:r>
+        <w:rPr>
+          <w:color w:val="15653A"/>
+        </w:rPr>
+        <w:t>We fitted Gaussian-family generalised linear models (GLMs) to national crude and Brazil-standardised annual rates and ordinary least squares (OLS) to age-group and WHO-standardised rates. The identity-link Gaussian trends are numerically equivalent to OLS. Slopes were expressed as deaths per 100,000 per year, with t intervals using n−2 residual degrees of freedom. We reported absolute and relative endpoint changes separately from annual slopes.</w:t>
+      </w:r>
+    </w:p>
+    <w:p>
+      <w:r>
+        <w:rPr>
+          <w:color w:val="15653A"/>
+        </w:rPr>
+        <w:t>Count models used log-link Poisson, quasi-Poisson and negative binomial families [10]. For unadjusted age domains, log E[Y(t)] = α + β × year(t) + log population(t). The national age-adjusted model was log E[Y(b,t)] = α + γ(b) + β × year(t) + log population(b,t). Its nine categorical bands were 7–14 (reference), 15–24, 25–34, 35–44, 45–54, 55–64, 65–74, 75–84 and 85+. Annual percentage change was APC = 100 × (exp β − 1), with intervals obtained by transforming β ± critical value × standard error (SE). Quasi-Poisson used the t distribution with model residual degrees of freedom; Poisson and negative binomial used normal Wald intervals.</w:t>
+      </w:r>
+    </w:p>
+    <w:p>
+      <w:r>
+        <w:rPr>
+          <w:color w:val="15653A"/>
+        </w:rPr>
+        <w:t>Quasi-Poisson scales Poisson coefficient variance by estimated dispersion. Negative binomial estimates the quadratic variance function μ + μ²/θ and can change coefficients as well as uncertainty. For every specification, we recorded Pearson dispersion, θ, mean-model convergence, iterations, errors and warnings. Large θ estimates with iteration warnings were interpreted as approaching the Poisson limit; these warnings prevent a claim of successful θ convergence or exact equivalence to Poisson.</w:t>
+      </w:r>
+    </w:p>
+    <w:p>
+      <w:r>
+        <w:rPr>
+          <w:color w:val="15653A"/>
+        </w:rPr>
+        <w:t>Each sensitivity changed one condition from the corrected primary analysis. We examined elapsed-days age, the original COVID rule, retention of all COVID mentions, the historical deduplication key, exclusion of 2020 and restriction to 2014–2019. The last two focused on 5–34 and 7–34 and retained actual calendar years as covariates. Excluding 2020 left seven observations and 5 trend residual degrees of freedom; restriction to 2014–2019 left six and 4. We evaluated both denominator revisions and both standards and reported every model regardless of statistical significance.</w:t>
+      </w:r>
+    </w:p>
+    <w:p>
+      <w:r>
+        <w:rPr>
+          <w:color w:val="15653A"/>
+        </w:rPr>
+        <w:t>Kitagawa accounting decomposition</w:t>
+      </w:r>
+    </w:p>
+    <w:p>
+      <w:r>
+        <w:rPr>
+          <w:color w:val="15653A"/>
+        </w:rPr>
+        <w:t>For the corrected ≥7 population, symmetric Kitagawa decomposition [11] partitioned crude differences into an age-composition term C and an age-specific-rate term R.</w:t>
+      </w:r>
+    </w:p>
+    <w:p>
+      <w:r>
+        <w:rPr>
+          <w:color w:val="15653A"/>
+        </w:rPr>
+        <w:t>C = Σ[a] (w(a,1) − w(a,0)) × (r(a,0) + r(a,1)) / 2.</w:t>
+      </w:r>
+    </w:p>
+    <w:p>
+      <w:r>
+        <w:rPr>
+          <w:color w:val="15653A"/>
+        </w:rPr>
+        <w:t>R = Σ[a] (r(a,1) − r(a,0)) × (w(a,0) + w(a,1)) / 2.</w:t>
+      </w:r>
+    </w:p>
+    <w:p>
+      <w:r>
+        <w:rPr>
+          <w:color w:val="15653A"/>
+        </w:rPr>
+        <w:t>Crude(1) − crude(0) = C + R, with r in deaths per 100,000 and each year's w normalised within ≥7.</w:t>
+      </w:r>
+    </w:p>
+    <w:p>
+      <w:r>
+        <w:rPr>
+          <w:color w:val="15653A"/>
+        </w:rPr>
+        <w:t>We used the same six endpoint pairs with IBGE 2018 and 2024, namely 2014–2021, 2014–2019, 2014–2020, 2015–2021, 2016–2021 and 2014–2018. We checked the identities at full precision before rounding each displayed component independently. This can produce a discrepancy in the last displayed digit. Shares above 100% indicate that a negative rate term offsets part of the composition term. The decomposition is descriptive and does not identify causal mechanisms.</w:t>
+      </w:r>
+    </w:p>
+    <w:p>
+      <w:r>
+        <w:rPr>
+          <w:color w:val="15653A"/>
+        </w:rPr>
+        <w:t>Software, reproducibility and ethics</w:t>
+      </w:r>
+    </w:p>
+    <w:p>
+      <w:r>
+        <w:rPr>
+          <w:color w:val="15653A"/>
+        </w:rPr>
+        <w:t>We used R 4.6.1 [12] for reproduction and revision; the reference reported R 4.3.3. The code records versions, configurations, hashes, warnings and independent checks. Public inputs and separate scenario outputs support reproduction. Code and revision outputs are available at https://github.com/EduIntellect/asthma-mortality-brazil-reanalysis/tree/revision/amaury-review .</w:t>
+      </w:r>
+    </w:p>
+    <w:p>
+      <w:r>
+        <w:rPr>
+          <w:color w:val="15653A"/>
+        </w:rPr>
+        <w:t>Recovered official SIM archives reproduced the recorded selection counts and year-age aggregates exactly. Historical execution hashes exist only for 2020–2021, preventing confirmation of historical file identity for 2014–2019. The supplement and provenance manifest document the manuscript reference, concordant Word, code commit and input hashes.</w:t>
+      </w:r>
+    </w:p>
+    <w:p>
+      <w:r>
+        <w:rPr>
+          <w:color w:val="15653A"/>
+        </w:rPr>
+        <w:t>Codex assisted code revision and analysis checking. Figures were plotted directly from analytical results. Editorial AI assistance is disclosed in Acknowledgements.</w:t>
+      </w:r>
+    </w:p>
+    <w:p>
+      <w:r>
         <w:t>The study used publicly accessible SIM mortality data and aggregated population projections without direct contact with participants. No identifying personal information was included in the reported results.</w:t>
-      </w:r>
-    </w:p>
-    <w:p>
-      <w:r>
-        <w:rPr>
-          <w:color w:val="15653A"/>
-        </w:rPr>
-        <w:t>Study design and reference reproduction</w:t>
-      </w:r>
-    </w:p>
-    <w:p>
-      <w:r>
-        <w:rPr>
-          <w:color w:val="15653A"/>
-        </w:rPr>
-        <w:t>This secondary ecological analysis used the Brazilian Mortality Information System (SIM) to examine national underlying-cause asthma mortality in Brazil during 2014–2021. The corrected primary population comprised people aged ≥7 completed years. We analysed ages 5–34 separately and used the nested 7–34 group to assess sensitivity to ages five and six; 35–59 and ≥60 provided further comparisons. The historical analysis using continuous age &gt;6 was reproduced separately. The primary analysis retained IBGE 2018 denominators and Brazil 2014 standard weights. Sensitivity analyses and descriptive decomposition complemented the primary estimates. We applied no multiple-testing correction.</w:t>
-      </w:r>
-    </w:p>
-    <w:p>
-      <w:r>
-        <w:rPr>
-          <w:color w:val="15653A"/>
-        </w:rPr>
-        <w:t>We reproduced the historical analysis against the archived manuscript and versioned analytical code. Provenance details are reported under Software, reproducibility and ethics.</w:t>
-      </w:r>
-    </w:p>
-    <w:p>
-      <w:r>
-        <w:rPr>
-          <w:color w:val="15653A"/>
-        </w:rPr>
-        <w:t>Selection, COVID mentions and record identity</w:t>
-      </w:r>
-    </w:p>
-    <w:p>
-      <w:r>
-        <w:rPr>
-          <w:color w:val="15653A"/>
-        </w:rPr>
-        <w:t>We selected records whose underlying cause field, CAUSABAS, contained International Classification of Diseases, tenth revision (ICD-10), J45 or J46 [5]. To retain the historical search scope, the corrected COVID rule searched LINHAA, LINHAB, LINHAC, LINHAD and LINHAII for B342, U072, U071 or literal COVID-19. A match in any field excluded the record once. We logged each code frequency and overlapping combination separately. Sensitivities used the original rule without U071 or retained all records with COVID mentions.</w:t>
-      </w:r>
-    </w:p>
-    <w:p>
-      <w:r>
-        <w:rPr>
-          <w:color w:val="15653A"/>
-        </w:rPr>
-        <w:t>The historical key combined death date, elapsed-days age, underlying cause and five cause lines. It collapsed two 2018 records with differences in occupation and administrative fields. The death-declaration identifier NUMERODO, described in the SIM dictionary [6], is absent from the public CSVs. Available fields therefore cannot establish a shared death. We retained both records and assessed their collapse as a sensitivity. Supplementary methods document the rows and fields.</w:t>
-      </w:r>
-    </w:p>
-    <w:p>
-      <w:r>
-        <w:rPr>
-          <w:color w:val="15653A"/>
-        </w:rPr>
-        <w:t>Calendar ages and analytical domains</w:t>
-      </w:r>
-    </w:p>
-    <w:p>
-      <w:r>
-        <w:rPr>
-          <w:color w:val="15653A"/>
-        </w:rPr>
-        <w:t>Completed age was the difference between death and birth years, reduced by one if death preceded that year's birthday. For births on 29 February, the anniversary in a non-leap year was 1 March. Missing or invalid dates and birth after death were excluded and logged separately. We applied no upper-age exclusion and grouped ages ≥90 into the IBGE 90+ interval. Date parsing is detailed in the supplement.</w:t>
-      </w:r>
-    </w:p>
-    <w:p>
-      <w:r>
-        <w:rPr>
-          <w:color w:val="15653A"/>
-        </w:rPr>
-        <w:t>Calendar age defined the ≥7, 5–34, 7–34, 35–59 and ≥60 groups. One sensitivity used days/365.25, with its floor defining single-year bins. The historical reproduction retained the continuous &gt;6 threshold as a separate population.</w:t>
-      </w:r>
-    </w:p>
-    <w:p>
-      <w:r>
-        <w:rPr>
-          <w:color w:val="15653A"/>
-        </w:rPr>
-        <w:t>Denominators and direct standardisation</w:t>
-      </w:r>
-    </w:p>
-    <w:p>
-      <w:r>
-        <w:rPr>
-          <w:color w:val="15653A"/>
-        </w:rPr>
-        <w:t>National single-year populations for both sexes came from the Brazilian Institute of Geography and Statistics (IBGE) 2018 revision [7]; the 2024 revision following the 2022 Census provided a sensitivity [8]. Both revisions provide single-year ages 0–89 and an open 90+ interval; workbook extraction is documented in the supplement. Corrected crude rates matched each numerator to the same population age range. To reproduce the historical construction, we divided continuous-age &gt;6 deaths by the entire population and separately by population ≥7. The latter comparator retains the small mismatch between its historical numerator and denominator.</w:t>
-      </w:r>
-    </w:p>
-    <w:p>
-      <w:r>
-        <w:rPr>
-          <w:color w:val="15653A"/>
-        </w:rPr>
-        <w:t>For age domain D and year t, we calculated the directly age-standardised rate (ASR) as follows.</w:t>
-      </w:r>
-    </w:p>
-    <w:p>
-      <w:r>
-        <w:rPr>
-          <w:color w:val="15653A"/>
-        </w:rPr>
-        <w:t>ASR(t,D) = Σ[a∈D] w(a,D) × 100,000 × deaths(a,t) / population(a,t).</w:t>
-      </w:r>
-    </w:p>
-    <w:p>
-      <w:r>
-        <w:rPr>
-          <w:color w:val="15653A"/>
-        </w:rPr>
-        <w:t>w(a,D) = population(a,2014) / Σ[j∈D] population(j,2014), so Σ[a∈D] w(a,D) = 1.</w:t>
-      </w:r>
-    </w:p>
-    <w:p>
-      <w:r>
-        <w:rPr>
-          <w:color w:val="15653A"/>
-        </w:rPr>
-        <w:t>Weights were fixed across years and normalised separately within each age domain, including 5–34 and 7–34. Each denominator revision supplied its own Brazil 2014 standard population. Deaths and population at ≥90 shared one open interval. World Health Organization (WHO) standardisation used five-year bands [9], combining the 90–94, 95–99 and ≥100 weights for 90+. We allocated three fifths of the WHO 5–9 weight to 7–9 before normalisation, assuming a uniform distribution within that band. Missing death-count cells were assigned zero; population cells had to be complete and positive. We checked that Brazil-2014-standardised and aligned crude rates were equal in 2014.</w:t>
-      </w:r>
-    </w:p>
-    <w:p>
-      <w:r>
-        <w:rPr>
-          <w:color w:val="15653A"/>
-        </w:rPr>
-        <w:t>Trends, count models and sensitivity scenarios</w:t>
-      </w:r>
-    </w:p>
-    <w:p>
-      <w:r>
-        <w:rPr>
-          <w:color w:val="15653A"/>
-        </w:rPr>
-        <w:t>We fitted Gaussian-family generalised linear models (GLMs) to national crude and Brazil-standardised annual rates and ordinary least squares (OLS) to age-group and WHO-standardised rates. The identity-link Gaussian trends are numerically equivalent to OLS. Slopes were expressed as deaths per 100,000 per year, with t intervals using n−2 residual degrees of freedom. We reported absolute and relative endpoint changes separately from annual slopes.</w:t>
-      </w:r>
-    </w:p>
-    <w:p>
-      <w:r>
-        <w:rPr>
-          <w:color w:val="15653A"/>
-        </w:rPr>
-        <w:t>Count models used log-link Poisson, quasi-Poisson and negative binomial families [10]. For unadjusted age domains, log E[Y(t)] = α + β × year(t) + log population(t). The national age-adjusted model was log E[Y(b,t)] = α + γ(b) + β × year(t) + log population(b,t). Its nine categorical bands were 7–14 (reference), 15–24, 25–34, 35–44, 45–54, 55–64, 65–74, 75–84 and 85+. Annual percentage change was APC = 100 × (exp β − 1), with intervals obtained by transforming β ± critical value × standard error (SE). Quasi-Poisson used the t distribution with model residual degrees of freedom; Poisson and negative binomial used normal Wald intervals.</w:t>
-      </w:r>
-    </w:p>
-    <w:p>
-      <w:r>
-        <w:rPr>
-          <w:color w:val="15653A"/>
-        </w:rPr>
-        <w:t>Quasi-Poisson scales Poisson coefficient variance by estimated dispersion. Negative binomial estimates the quadratic variance function μ + μ²/θ and can change coefficients as well as uncertainty. For every specification, we recorded Pearson dispersion, θ, mean-model convergence, iterations, errors and warnings. Large θ estimates with iteration warnings were interpreted as approaching the Poisson limit; these warnings prevent a claim of successful θ convergence or exact equivalence to Poisson.</w:t>
-      </w:r>
-    </w:p>
-    <w:p>
-      <w:r>
-        <w:rPr>
-          <w:color w:val="15653A"/>
-        </w:rPr>
-        <w:t>Each sensitivity changed one condition from the corrected primary analysis. We examined elapsed-days age, the original COVID rule, retention of all COVID mentions, the historical deduplication key, exclusion of 2020 and restriction to 2014–2019. The last two focused on 5–34 and 7–34 and retained actual calendar years as covariates. Excluding 2020 left seven observations and 5 trend residual degrees of freedom; restriction to 2014–2019 left six and 4. We evaluated both denominator revisions and both standards and reported every model regardless of statistical significance.</w:t>
-      </w:r>
-    </w:p>
-    <w:p>
-      <w:r>
-        <w:rPr>
-          <w:color w:val="15653A"/>
-        </w:rPr>
-        <w:t>Kitagawa accounting decomposition</w:t>
-      </w:r>
-    </w:p>
-    <w:p>
-      <w:r>
-        <w:rPr>
-          <w:color w:val="15653A"/>
-        </w:rPr>
-        <w:t>For the corrected ≥7 population, symmetric Kitagawa decomposition [11] partitioned crude differences into an age-composition term C and an age-specific-rate term R.</w:t>
-      </w:r>
-    </w:p>
-    <w:p>
-      <w:r>
-        <w:rPr>
-          <w:color w:val="15653A"/>
-        </w:rPr>
-        <w:t>C = Σ[a] (w(a,1) − w(a,0)) × (r(a,0) + r(a,1)) / 2.</w:t>
-      </w:r>
-    </w:p>
-    <w:p>
-      <w:r>
-        <w:rPr>
-          <w:color w:val="15653A"/>
-        </w:rPr>
-        <w:t>R = Σ[a] (r(a,1) − r(a,0)) × (w(a,0) + w(a,1)) / 2.</w:t>
-      </w:r>
-    </w:p>
-    <w:p>
-      <w:r>
-        <w:rPr>
-          <w:color w:val="15653A"/>
-        </w:rPr>
-        <w:t>Crude(1) − crude(0) = C + R, with r in deaths per 100,000 and each year's w normalised within ≥7.</w:t>
-      </w:r>
-    </w:p>
-    <w:p>
-      <w:r>
-        <w:rPr>
-          <w:color w:val="15653A"/>
-        </w:rPr>
-        <w:t>We used the same six endpoint pairs with IBGE 2018 and 2024, namely 2014–2021, 2014–2019, 2014–2020, 2015–2021, 2016–2021 and 2014–2018. We checked the identities at full precision before rounding each displayed component independently. This can produce a discrepancy in the last displayed digit. Shares above 100% indicate that a negative rate term offsets part of the composition term. The decomposition is descriptive and does not identify causal mechanisms.</w:t>
-      </w:r>
-    </w:p>
-    <w:p>
-      <w:r>
-        <w:rPr>
-          <w:color w:val="15653A"/>
-        </w:rPr>
-        <w:t>Software, reproducibility and ethics</w:t>
-      </w:r>
-    </w:p>
-    <w:p>
-      <w:r>
-        <w:rPr>
-          <w:color w:val="15653A"/>
-        </w:rPr>
-        <w:t>We used R 4.6.1 [12] for reproduction and revision; the reference reported R 4.3.3. The code records versions, configurations, hashes, warnings and independent checks. Public inputs and separate scenario outputs support reproduction. Code and revision outputs are available at https://github.com/EduIntellect/asthma-mortality-brazil-reanalysis/tree/revision/amaury-review .</w:t>
-      </w:r>
-    </w:p>
-    <w:p>
-      <w:r>
-        <w:rPr>
-          <w:color w:val="15653A"/>
-        </w:rPr>
-        <w:t>Recovered official SIM archives reproduced the recorded selection counts and year-age aggregates exactly. Historical execution hashes exist only for 2020–2021, preventing confirmation of historical file identity for 2014–2019. The supplement and provenance manifest document the manuscript reference, concordant Word, code commit and input hashes.</w:t>
-      </w:r>
-    </w:p>
-    <w:p>
-      <w:r>
-        <w:rPr>
-          <w:color w:val="15653A"/>
-        </w:rPr>
-        <w:t>Codex assisted code revision and analysis checking. Figures were plotted directly from analytical results. Editorial AI assistance is disclosed in Acknowledgements.</w:t>
-      </w:r>
-    </w:p>
-    <w:p>
-      <w:r>
-        <w:rPr>
-          <w:color w:val="15653A"/>
-        </w:rPr>
-        <w:t>The study used public SIM mortality records and aggregate IBGE projections, with no participant contact, and reports only aggregate results. No formally granted ethics approval or exemption is claimed.</w:t>
       </w:r>
     </w:p>
     <w:p>

</xml_diff>